<commit_message>
HW2: add email and TA to answer sheet
Co-Authored-By: Claude Opus 5.5 <noreply@anthropic.com>
Claude-Session: https://claude.ai/code/session_018yPRuyonnStWUjR8WnJBtT
</commit_message>
<xml_diff>
--- a/hw2/HW2_Answer_Sheet.docx
+++ b/hw2/HW2_Answer_Sheet.docx
@@ -129,6 +129,9 @@
               <w:keepLines/>
               <w:spacing w:after="0" w:line="264" w:lineRule="auto"/>
             </w:pPr>
+            <w:r>
+              <w:t>lworrich@tamu.edu</w:t>
+            </w:r>
           </w:p>
         </w:tc>
       </w:tr>
@@ -164,6 +167,9 @@
               <w:keepLines/>
               <w:spacing w:after="0" w:line="264" w:lineRule="auto"/>
             </w:pPr>
+            <w:r>
+              <w:t>Do-hoon</w:t>
+            </w:r>
           </w:p>
         </w:tc>
       </w:tr>

</xml_diff>

<commit_message>
HW2: simplify write-up wording
Co-Authored-By: Claude Opus 5.5 <noreply@anthropic.com>
Claude-Session: https://claude.ai/code/session_018yPRuyonnStWUjR8WnJBtT
</commit_message>
<xml_diff>
--- a/hw2/HW2_Answer_Sheet.docx
+++ b/hw2/HW2_Answer_Sheet.docx
@@ -683,7 +683,7 @@
               <w:spacing w:after="0" w:line="264" w:lineRule="auto"/>
             </w:pPr>
             <w:r>
-              <w:t>The poll of 401 is meant to describe all 59,838 adults on Merrow (the census list). Its estimand is the island's yes share on Proposition 1, which the census puts at 50.2%.</w:t>
+              <w:t>The poll is supposed to describe all 59,838 adults on Merrow. The estimand is the share of all of them who voted yes on Prop 1, which the census says is 50.2%.</w:t>
             </w:r>
           </w:p>
         </w:tc>
@@ -742,7 +742,7 @@
               <w:spacing w:after="0" w:line="264" w:lineRule="auto"/>
             </w:pPr>
             <w:r>
-              <w:t>HOMEOWNERS SPEAK: NO, 55 TO 45. The 10,000 cards came from the property-tax roll, so they measured homeowners only. In the census, 44.8% of homeowners voted yes.</w:t>
+              <w:t>HOMEOWNERS SPEAK: NO, 55 TO 45. The cards only went to people on the property-tax roll, so they only measured homeowners. In the census, 44.8% of homeowners voted yes.</w:t>
             </w:r>
           </w:p>
         </w:tc>
@@ -813,7 +813,7 @@
               <w:spacing w:after="0" w:line="264" w:lineRule="auto"/>
             </w:pPr>
             <w:r>
-              <w:t>Each bar counts how many of the 1,000 polls of 401 had a yes share inside that bar's narrow range. The 1,000 shares center on about 50.2%, the island's share, and nearly all of them fall between about 44% and 57%.</w:t>
+              <w:t>Each bar counts how many of the 1,000 polls got a yes share in that 1-point range. The shares center around 50.2% (right at the gold line), and almost all of them are between about 44% and 57%.</w:t>
             </w:r>
           </w:p>
         </w:tc>
@@ -872,7 +872,7 @@
               <w:spacing w:after="0" w:line="264" w:lineRule="auto"/>
             </w:pPr>
             <w:r>
-              <w:t>The 2.5 points is the standard error: the standard deviation of the 1,000 poll shares, or how far a typical poll of 401 lands from the center of the sampling distribution. It describes the spread of all the polls the station could have drawn. It does not say how far this one poll missed. The station's poll actually found 49.1% against the island's 50.2%, so it was 1.1 percentage points off (low).</w:t>
+              <w:t>The 2.5 points isn't how far off our poll was. It's the standard deviation of the 1,000 poll shares, so it's how far a typical poll of 401 lands from the center. It describes how much polls like ours bounce around. Our actual poll got 49.1% and the island was 50.2%, so we were only 1.1 points off.</w:t>
             </w:r>
           </w:p>
         </w:tc>
@@ -944,7 +944,7 @@
               <w:spacing w:after="0" w:line="264" w:lineRule="auto"/>
             </w:pPr>
             <w:r>
-              <w:t>The island's share is 0.22 / 1.6 ≈ 0.14 standard errors above 50%, which is barely above it. My below_50_1001 is 0.445, so about 44.5% of polls of 1,001 should put "no" ahead. That is close to the 437 of 1,000 (43.7%) that did in my simulated polls of 1,001. Even a fairly big random poll calls this vote wrong almost half the time, because the true margin is far smaller than the standard error.</w:t>
+              <w:t>The island's share is 0.22 / 1.6 = about 0.14 standard errors above 50%, so it's barely above. below_50_1001 is 0.445, so about 44.5% of polls of 1,001 should put no ahead. That's really close to my 1,000 polls, where 437 (43.7%) had no ahead. So even a poll of 1,001 gets this vote wrong almost half the time because it was so close.</w:t>
             </w:r>
           </w:p>
         </w:tc>
@@ -1024,7 +1024,7 @@
               <w:spacing w:after="0" w:line="264" w:lineRule="auto"/>
             </w:pPr>
             <w:r>
-              <w:t>The island's share is a fixed number, so this one interval either contains it or it doesn't. No 95% chance is involved after the fact. The 95% describes the method: if we drew many random polls of 401 and built a 95% interval from each, about 95% of those intervals would contain the island's share. My block 7 bears this out: 948 of 1,000 intervals (94.8%) contained 50.2%.</w:t>
+              <w:t>The island's share is just one fixed number, so after you build the interval it either has it or it doesn't. The 95% is about the method: if you kept drawing random polls of 401 and making intervals the same way, about 95% of them would contain the island's share. That's what happened in block 7, where 948 out of 1,000 (94.8%) contained it.</w:t>
             </w:r>
           </w:p>
         </w:tc>
@@ -1083,7 +1083,7 @@
               <w:spacing w:after="0" w:line="264" w:lineRule="auto"/>
             </w:pPr>
             <w:r>
-              <w:t>About 5% of 280, so roughly 14 intervals would miss. Mine (seed 4229: 40.8% to 50.5%) did contain 50.2%, so it was not one of them. Without the census, a student would have no way to know whether their own interval missed, because the island's share is exactly what the poll is trying to estimate.</w:t>
+              <w:t>About 5% of 280, so around 14 intervals would miss. Mine (seed 4229, 40.8% to 50.5%) did contain 50.2%, so it wasn't one of them. Without the census a student couldn't tell if theirs missed, because the island's share is the thing you don't know.</w:t>
             </w:r>
           </w:p>
         </w:tc>
@@ -1154,7 +1154,7 @@
               <w:spacing w:after="0" w:line="264" w:lineRule="auto"/>
             </w:pPr>
             <w:r>
-              <w:t>Bias = E[Ȳ] − μ = 44.8% − 50.2% = −5.4 percentage points. With 20,000 cards, the standard error would shrink by a factor of 1/√2, from about 0.50 to about 0.35 points. The margin of error would shrink from about 1.0 to about 0.7 points. The center of the Gazette's sampling distribution would stay at 44.8%, the homeowners' share, so the bias would stay at −5.4 points. The miss was not bad luck. It was bias from polling only homeowners, and more cards cannot fix it.</w:t>
+              <w:t>Bias = 44.8% − 50.2% = −5.4 points. With 20,000 cards the standard error would get smaller (about 0.5 to 0.35 points) and so would the margin of error (about 1.0 to 0.7 points). But the center would still be 44.8% because it's still only homeowners, so the bias stays at −5.4. It wasn't bad luck. The problem is who they polled, not how many.</w:t>
             </w:r>
           </w:p>
         </w:tc>
@@ -1214,7 +1214,7 @@
               <w:spacing w:after="0" w:line="264" w:lineRule="auto"/>
             </w:pPr>
             <w:r>
-              <w:t>A Gazette interval is always centered on a share near 44.8%, the homeowners' share, not the island's 50.2%. As the poll grows, the interval gets narrower around 44.8%, while 50.2% stays 5.4 points away. At 401 cards the interval (about ±4.9 points) is wide enough to reach 50.2% fairly often. At 1,001 (about ±3.1) it seldom does, and at 10,000 (about ±1.0) it never does. Bigger Gazette polls just get more precise about the wrong number.</w:t>
+              <w:t>The Gazette's intervals are always centered around 44.8%, the homeowners' share. When the poll gets bigger, the interval gets narrower, but it's still centered in the wrong place. At 401 cards the interval is wide enough (about ±4.9 points) to reach 50.2% sometimes, but at 1,001 (±3.1) it mostly doesn't, and at 10,000 (±1.0) it never does.</w:t>
             </w:r>
           </w:p>
         </w:tc>
@@ -1273,7 +1273,7 @@
               <w:spacing w:after="0" w:line="264" w:lineRule="auto"/>
             </w:pPr>
             <w:r>
-              <w:t>The Gazette's polls would have centered on about 62%, the homeowners' share. Their bias was 62 − 59.5 = +2.5 percentage points, and they still named the winner, since yes was above 50% both among homeowners and on the island. A biased poll can still name the winner when its bias isn't big enough to push its share across 50%, to the other side from the true result.</w:t>
+              <w:t>The polls would have centered on 62%, the homeowners' share. The bias was 62 − 59.5 = +2.5 points. They still named the winner because yes was over 50% either way. A biased poll can still get the winner right as long as the bias isn't big enough to push it to the other side of 50%.</w:t>
             </w:r>
           </w:p>
         </w:tc>
@@ -1352,7 +1352,7 @@
               <w:br/>
               <w:t>n = 28² = 784</w:t>
               <w:br/>
-              <w:t>The station should interview 784 islanders.</w:t>
+              <w:t>So the station should interview 784 islanders.</w:t>
             </w:r>
           </w:p>
         </w:tc>
@@ -1411,7 +1411,7 @@
               <w:spacing w:after="0" w:line="264" w:lineRule="auto"/>
             </w:pPr>
             <w:r>
-              <w:t>(1) Radio Merrow interviewed 784 adult islanders, drawn at random from the census list of every adult on Merrow. (2) The poll's margin of error is about 3.5 percentage points. (3) Even a random poll can miss by more than its margin of error through bad luck in which islanders happen to be drawn, and that happens in about 1 poll in 20. (4) A poll can also miss when it is drawn from a list that leaves out part of the island. The Gazette's mailing to homeowners only is an example: its polls centered on the homeowners' 44.8% instead of the island's 50.2%, however many cards it mailed.</w:t>
+              <w:t>(1) We interviewed 784 adults chosen at random from the census list of everyone on Merrow. (2) The margin of error is about 3.5 percentage points. (3) Even a random poll can miss by more than that just by bad luck in who gets picked, which happens about 1 time in 20. (4) A poll can also miss if it only samples part of the island, like the Gazette, which only polls homeowners, so its polls center on 44.8% instead of the island's 50.2% no matter how many cards it sends.</w:t>
             </w:r>
           </w:p>
         </w:tc>
@@ -2297,7 +2297,7 @@
               <w:spacing w:after="0" w:line="264" w:lineRule="auto"/>
             </w:pPr>
             <w:r>
-              <w:t>If renters and owners on Merrow averaged the same number of political acts, a random poll of 1,001 would show a gap at least as big as the one we found (0.24 acts, in either direction) only about 0.7% of the time. p is the probability of data like ours if the null is true. It is not the probability that the null is false, or that Mr. Mull is right.</w:t>
+              <w:t>If renters and owners on Merrow actually did the same number of political acts on average, there would only be about a 0.7% chance of getting a gap as big as 0.24 acts (in either direction) in a random poll like ours. It's not the chance that Mr. Mull is right.</w:t>
             </w:r>
           </w:p>
         </w:tc>
@@ -2357,7 +2357,7 @@
               <w:spacing w:after="0" w:line="264" w:lineRule="auto"/>
             </w:pPr>
             <w:r>
-              <w:t>No. The p-value measures how far the gap is from zero in standard errors, and the standard error shrinks as the poll grows. A large poll can give a tiny p-value for a gap that is substantively trivial, so p says nothing about size by itself. My assessment: the gap of 0.24 acts is 28% of the owners' average (0.87) and 38% of the renters' average (0.63). Next to the averages it looks sizable, since renters do roughly a quarter to a third fewer acts. But it is only about 20% of the standard deviation of political acts (0.24 / 1.19 for everyone; 0.24 / 1.22 for owners; 0.24 / 1.13 for renters). Next to how much individual islanders vary, it looks small. Overall I'd call it a real but modest difference: most renters and most owners both do zero or one act.</w:t>
+              <w:t>No. The p-value just tells you whether the gap is far from zero compared to its standard error, and with a big sample even a tiny gap can get a small p-value. So it doesn't say anything about whether the gap matters. The gap is 0.24 / 0.87 = about 28% of the owners' average and 0.24 / 0.63 = about 38% of the renters' average, which seems pretty big. But compared to the standard deviation for everyone (1.19) it's only about 20%, which seems small. I'd say it's a real difference but a modest one, since most renters and owners both do 0 or 1 acts anyway.</w:t>
             </w:r>
           </w:p>
         </w:tc>
@@ -2437,7 +2437,7 @@
               <w:spacing w:after="0" w:line="264" w:lineRule="auto"/>
             </w:pPr>
             <w:r>
-              <w:t>No. The September interval, −6.1 to 35.2 points, includes zero, so it does not rule out a gap of zero. It also includes 14 points, so it does not rule out a gap the size of the census gap either. The poll is consistent both with no difference and with a large one. It is inconclusive and does not show that renters and owners vote alike: failing to reject the null is not evidence that the null is true. Because the census gap is 14.0 points, the null hypothesis is false, and the September test failed to reject it. That is a false negative (Type II error).</w:t>
+              <w:t>No, the interval (−6.1 to 35.2) includes 0, so it doesn't rule out a gap of zero. But it also includes 14, so it doesn't rule out a gap the size of the census gap either. The poll basically can't tell, so it doesn't show renters and owners vote alike. Not rejecting the null isn't the same as proving it. Since the real census gap is 14.0 points, the null was false and the test didn't reject it, so it was a false negative.</w:t>
             </w:r>
           </w:p>
         </w:tc>
@@ -2496,7 +2496,7 @@
               <w:spacing w:after="0" w:line="264" w:lineRule="auto"/>
             </w:pPr>
             <w:r>
-              <w:t>Margin of error: September poll (35.2 − (−6.1)) / 2 ≈ 20.6 points; poll of 1,001 (22.4 − 9.2) / 2 ≈ 6.6 points. The September margin is so much bigger because that poll had only 40 renters and 55 owners, against 338 and 601 in the poll of 1,001. The standard error of the gap depends on each group's size, so small groups give an imprecise gap. In September the gap (14.5) is smaller than its margin of error (20.6), so the interval stretches past zero and the test cannot reject. In the poll of 1,001 the gap (15.8) is more than twice its margin of error (6.6), so the whole interval is above zero and the test rejects.</w:t>
+              <w:t>September poll: (35.2 − (−6.1)) / 2 = about 20.6 points. Poll of 1,001: (22.4 − 9.2) / 2 = about 6.6 points. The September poll's margin is so much bigger because it only had 40 renters and 55 owners, compared to 338 and 601 in the big poll, so its estimate of the gap is way less precise. In September the gap (14.5) is smaller than the margin (20.6), so the interval goes past zero and it can't reject. In the poll of 1,001 the gap (15.8) is more than twice the margin (6.6), so the whole interval is above zero and it rejects.</w:t>
             </w:r>
           </w:p>
         </w:tc>
@@ -2556,7 +2556,7 @@
               <w:spacing w:after="0" w:line="264" w:lineRule="auto"/>
             </w:pPr>
             <w:r>
-              <w:t>No. The ratio is 20.6 / 6.6 ≈ 3.1, not 10. In √(s²₁/n₁ + s²₂/n₂), the n's sit inside a square root, so multiplying both group sizes by about 10 divides the standard error (and the margin of error) by about √10 ≈ 3.2, not by 10. Adding 25 renters and 25 owners (using s ≈ 0.5): in the September poll the margin would fall from about 20.4 to 16.4 points, a drop of about 4 points. In the poll of 1,001 it would fall only from about 6.7 to 6.5 points, a drop of about 0.2. So the 50 islanders shrink the margin far more in the September poll. In general, each additional respondent shrinks the margin of error by less as the sample grows (diminishing returns), because the margin falls with 1/√n.</w:t>
+              <w:t>No. 20.6 / 6.6 = about 3.1, not 10. In the formula the n's are under a square root, so making the groups about 10 times bigger only makes the standard error about √10 = 3.2 times smaller. If you add 25 renters and 25 owners (using s = 0.5), the September poll's margin goes from about 20.4 to 16.4 points (about 4 points smaller), but the poll of 1,001's margin only goes from about 6.7 to 6.5 (about 0.2 smaller). So the extra people help a lot more in the September poll. In general each extra person shrinks the margin of error by less as the poll gets bigger.</w:t>
             </w:r>
           </w:p>
         </w:tc>
@@ -2636,7 +2636,7 @@
               <w:spacing w:after="0" w:line="264" w:lineRule="auto"/>
             </w:pPr>
             <w:r>
-              <w:t>No. The p-value measures how likely a correlation as strong as 0.53 would be if renter share and the yes vote were actually unrelated (r = 0). With 436 districts, even a moderate correlation is very unlikely to arise by chance, so p is tiny. That tells us the relationship is not zero. It does not tell us the relationship is close to perfect. (The 436 districts are also the whole island, so there is no larger population left to infer to.) r = 0.53 tells readers how strong and in what direction the relationship is: a moderate positive one. Districts with more renters tended to vote yes more often, but there is lots of scatter, and many districts with similar renter shares voted very differently. Rewritten caption: "Districts with more renters tended to vote yes on Proposition 1, but renter share is far from a perfect predictor of how a district voted (r = 0.53)."</w:t>
+              <w:t>No. The p-value only tells you how unlikely an r of 0.53 would be if there was actually no relationship at all. With 436 districts, even a medium relationship is really unlikely to happen by chance, so p is tiny, but that doesn't mean it's close to perfect. (Also, the 436 districts are the whole island, so it's not really a sample anyway.) r = 0.53 tells you it's a moderate positive relationship: districts with more renters tended to vote yes more, but there's a lot of scatter. New caption: "Districts with more renters tended to vote yes on Proposition 1, but renter share is far from a perfect predictor (r = 0.53)."</w:t>
             </w:r>
           </w:p>
         </w:tc>
@@ -2716,7 +2716,7 @@
               <w:spacing w:after="0" w:line="264" w:lineRule="auto"/>
             </w:pPr>
             <w:r>
-              <w:t>The homeowners' yes share would have to equal the island's yes share (50.2%). A random poll from homeowners alone is centered on, and so has expected value equal to, the homeowners' share: E[Ȳ] = homeowners' share. Its bias, E[Ȳ] − μ, is zero only if the homeowners' share equals μ. In other words, owners would have to vote like everyone else, which is exactly Mr. Mull's claim.</w:t>
+              <w:t>The homeowners' yes share would have to be the same as the island's (50.2%). A random poll of homeowners is centered on the homeowners' share, so E[Ȳ] is the homeowners' share. The bias E[Ȳ] − μ is only zero if those two are equal. Basically owners would have to vote the same as everyone else, which is what Mr. Mull is claiming.</w:t>
             </w:r>
           </w:p>
         </w:tc>
@@ -2776,7 +2776,7 @@
               <w:spacing w:after="0" w:line="264" w:lineRule="auto"/>
             </w:pPr>
             <w:r>
-              <w:t>Estimated bias = 41.9% − 47.9% = −6.0 percentage points. The owners' share (41.9%) estimates E[Ȳ], the share a homeowners-only poll would center on. The whole-poll share (47.9%) estimates μ, the island's share. A random poll of the whole island can estimate both because it is a random sample of every islander. The 601 owners in it are therefore themselves a random sample of the island's homeowners, so their share is an unbiased estimate of the homeowners' share, while all 1,001 together give an unbiased estimate of the island's share. My estimate (−6.0) differs from the census value (−5.4) because of sampling error: each of the two poll shares is subject to random error (47.9% is 2.3 points below 50.2%, and 41.9% is 2.9 points below 44.8%), so their difference also misses the true bias by chance.</w:t>
+              <w:t>41.9% − 47.9% = −6.0 points. The owners' share (41.9%) estimates E[Ȳ], since that's what a homeowners-only poll would center on, and the whole poll's share (47.9%) estimates μ. A random poll of the whole island can estimate both because the owners in it are also a random sample of all owners, and the whole poll is a random sample of everyone. My estimate (−6.0) is different from the census (−5.4) because of sampling error: both poll shares are a little off from the census just by chance (47.9 vs. 50.2 and 41.9 vs. 44.8), so the difference is a little off too.</w:t>
             </w:r>
           </w:p>
         </w:tc>

</xml_diff>